<commit_message>
docs: update individual contribution in Table 1 (Page 4) to Module 2
</commit_message>
<xml_diff>
--- a/Batch 3-SE- Sameer Ahmed G-192421154.docx
+++ b/Batch 3-SE- Sameer Ahmed G-192421154.docx
@@ -2509,7 +2509,7 @@
         </w:rPr>
       </w:pPr>
       <w:r>
-        <w:t>Note: The remaining modules of the shared RoadGuard AI project – Pothole Analysis &amp; Location Mapping (Module 2), Smart Maintenance &amp; Alert System (Module 3), and Emerging Technology, Monitoring &amp; Sustainability (Module 4) – were contributed by teammates N. Goutham and A. Govardhan Reddy respectively, and are described in this report for project completeness and context.</w:t>
+        <w:t>Note: The remaining modules of the shared RoadGuard AI project – Image Ingestion Pipeline (Module 1), Smart Maintenance &amp; Alert System (Module 3), and Emerging Technology, Monitoring &amp; Sustainability (Module 4) – were contributed by teammates N. Goutham and A. Govardhan Reddy respectively, and are described in this report for project completeness and context.</w:t>
       </w:r>
     </w:p>
     <w:p>
@@ -2913,12 +2913,7 @@
           </w:tcPr>
           <w:p>
             <w:r>
-              <w:br/>
-              <w:br/>
-              <w:br/>
-              <w:br/>
-              <w:br/>
-              <w:t>Module 1 – Image-Based Pothole Detection: AI detection, image processing, and frontend integration</w:t>
+              <w:t>Module 2 – Image-Based Pothole Detection: AI detection, image processing, and frontend integration</w:t>
             </w:r>
           </w:p>
         </w:tc>
@@ -3145,75 +3140,8 @@
             <w:tcW w:w="1767" w:type="dxa"/>
           </w:tcPr>
           <w:p>
-            <w:pPr>
-              <w:pStyle w:val="TableParagraph"/>
-              <w:ind w:left="0"/>
-              <w:rPr>
-                <w:i/>
-                <w:sz w:val="24"/>
-              </w:rPr>
-            </w:pPr>
-          </w:p>
-          <w:p>
-            <w:pPr>
-              <w:pStyle w:val="TableParagraph"/>
-              <w:ind w:left="0"/>
-              <w:rPr>
-                <w:i/>
-                <w:sz w:val="24"/>
-              </w:rPr>
-            </w:pPr>
-          </w:p>
-          <w:p>
-            <w:pPr>
-              <w:pStyle w:val="TableParagraph"/>
-              <w:spacing w:before="217"/>
-              <w:ind w:left="0"/>
-              <w:rPr>
-                <w:i/>
-                <w:sz w:val="24"/>
-              </w:rPr>
-            </w:pPr>
-          </w:p>
-          <w:p>
-            <w:pPr>
-              <w:pStyle w:val="TableParagraph"/>
-              <w:ind w:left="99" w:right="88"/>
-              <w:rPr>
-                <w:sz w:val="24"/>
-              </w:rPr>
-            </w:pPr>
-            <w:r>
-              <w:rPr>
-                <w:sz w:val="24"/>
-              </w:rPr>
-              <w:t xml:space="preserve">Authored the Module 1 section and contributed to the overall project report, </w:t>
-            </w:r>
-            <w:r>
-              <w:rPr>
-                <w:spacing w:val="-2"/>
-                <w:sz w:val="24"/>
-              </w:rPr>
-              <w:t xml:space="preserve">including </w:t>
-            </w:r>
-            <w:r>
-              <w:rPr>
-                <w:sz w:val="24"/>
-              </w:rPr>
-              <w:t xml:space="preserve">system design, </w:t>
-            </w:r>
-            <w:r>
-              <w:rPr>
-                <w:spacing w:val="-2"/>
-                <w:sz w:val="24"/>
-              </w:rPr>
-              <w:t xml:space="preserve">implementation, </w:t>
-            </w:r>
-            <w:r>
-              <w:rPr>
-                <w:sz w:val="24"/>
-              </w:rPr>
-              <w:t>and analysis.</w:t>
+            <w:r>
+              <w:t>Authored the Module 2 section and contributed to the overall project report, including system design, implementation, and analysis.</w:t>
             </w:r>
           </w:p>
         </w:tc>

</xml_diff>